<commit_message>
Unified Client & Server Multi-Locator Priority
</commit_message>
<xml_diff>
--- a/WEBAI_AUTOMATION/planning.docx
+++ b/WEBAI_AUTOMATION/planning.docx
@@ -1410,6 +1410,257 @@
       <w:proofErr w:type="gramEnd"/>
       <w:r>
         <w:t xml:space="preserve"> and we can spin up the next TDVC loop.</w:t>
+      </w:r>
+    </w:p>
+    <w:p/>
+    <w:p>
+      <w:pPr>
+        <w:pBdr>
+          <w:bottom w:val="dotted" w:sz="24" w:space="1" w:color="auto"/>
+        </w:pBdr>
+      </w:pPr>
+    </w:p>
+    <w:p/>
+    <w:p>
+      <w:r>
+        <w:t>Here is the optimal sequence for Phase 11.</w:t>
+      </w:r>
+    </w:p>
+    <w:p>
+      <w:pPr>
+        <w:rPr>
+          <w:b/>
+          <w:bCs/>
+        </w:rPr>
+      </w:pPr>
+      <w:r>
+        <w:rPr>
+          <w:b/>
+          <w:bCs/>
+        </w:rPr>
+        <w:t>Step 1: Stability &amp; Hardening (The Foundation)</w:t>
+      </w:r>
+    </w:p>
+    <w:p>
+      <w:r>
+        <w:t>Before introducing complex decision-making, the core execution loop must be flawless. This step addresses the runtime bugs you discovered during the Flipkart E2E test and secures the platform.</w:t>
+      </w:r>
+    </w:p>
+    <w:p>
+      <w:pPr>
+        <w:numPr>
+          <w:ilvl w:val="0"/>
+          <w:numId w:val="22"/>
+        </w:numPr>
+      </w:pPr>
+      <w:r>
+        <w:rPr>
+          <w:b/>
+          <w:bCs/>
+        </w:rPr>
+        <w:t>Post-HITL State Reset:</w:t>
+      </w:r>
+      <w:r>
+        <w:t xml:space="preserve"> Modify the server to clear the executed action from the queue immediately after a Human-in-the-Loop intervention so the planner does not get stuck in a repetitive loop.</w:t>
+      </w:r>
+    </w:p>
+    <w:p>
+      <w:pPr>
+        <w:numPr>
+          <w:ilvl w:val="0"/>
+          <w:numId w:val="22"/>
+        </w:numPr>
+      </w:pPr>
+      <w:r>
+        <w:rPr>
+          <w:b/>
+          <w:bCs/>
+        </w:rPr>
+        <w:t>Navigation &amp; Readiness:</w:t>
+      </w:r>
+      <w:r>
+        <w:t xml:space="preserve"> Wire up a </w:t>
+      </w:r>
+      <w:proofErr w:type="spellStart"/>
+      <w:r>
+        <w:t>validatePage</w:t>
+      </w:r>
+      <w:proofErr w:type="spellEnd"/>
+      <w:r>
+        <w:t xml:space="preserve"> function to trigger automatically after new tabs open or navigations occur, ensuring the AI waits for the network to idle and scrolls the page to expose hidden variant buttons.</w:t>
+      </w:r>
+    </w:p>
+    <w:p>
+      <w:pPr>
+        <w:numPr>
+          <w:ilvl w:val="0"/>
+          <w:numId w:val="22"/>
+        </w:numPr>
+      </w:pPr>
+      <w:r>
+        <w:rPr>
+          <w:b/>
+          <w:bCs/>
+        </w:rPr>
+        <w:t>Security Configuration:</w:t>
+      </w:r>
+      <w:r>
+        <w:t xml:space="preserve"> Shift the hardcoded API key out of run_from_database.py into a .env file and restrict CORS policies.</w:t>
+      </w:r>
+    </w:p>
+    <w:p>
+      <w:pPr>
+        <w:rPr>
+          <w:b/>
+          <w:bCs/>
+        </w:rPr>
+      </w:pPr>
+      <w:r>
+        <w:rPr>
+          <w:b/>
+          <w:bCs/>
+        </w:rPr>
+        <w:t>Step 2: The Logic Engine &amp; Observer Mode (The Brain)</w:t>
+      </w:r>
+    </w:p>
+    <w:p>
+      <w:r>
+        <w:t>Once the execution loop is stable, we upgrade the AI's ability to maintain context and handle multi-step flows.</w:t>
+      </w:r>
+    </w:p>
+    <w:p>
+      <w:pPr>
+        <w:numPr>
+          <w:ilvl w:val="0"/>
+          <w:numId w:val="23"/>
+        </w:numPr>
+      </w:pPr>
+      <w:r>
+        <w:rPr>
+          <w:b/>
+          <w:bCs/>
+        </w:rPr>
+        <w:t>Continuous Observer Mode:</w:t>
+      </w:r>
+      <w:r>
+        <w:t xml:space="preserve"> Upgrade the HITL plugin to inject a floating "Resume AI" button on the webpage. This allows the bot to pause, observe you navigating a login or size-selection flow, and take a fresh DOM snapshot once you click resume.</w:t>
+      </w:r>
+    </w:p>
+    <w:p>
+      <w:pPr>
+        <w:numPr>
+          <w:ilvl w:val="0"/>
+          <w:numId w:val="23"/>
+        </w:numPr>
+      </w:pPr>
+      <w:r>
+        <w:rPr>
+          <w:b/>
+          <w:bCs/>
+        </w:rPr>
+        <w:t>Variable Persistence:</w:t>
+      </w:r>
+      <w:r>
+        <w:t xml:space="preserve"> Upgrade </w:t>
+      </w:r>
+      <w:proofErr w:type="gramStart"/>
+      <w:r>
+        <w:t>page._</w:t>
+      </w:r>
+      <w:proofErr w:type="gramEnd"/>
+      <w:r>
+        <w:t>_</w:t>
+      </w:r>
+      <w:proofErr w:type="spellStart"/>
+      <w:r>
+        <w:t>extracted_data</w:t>
+      </w:r>
+      <w:proofErr w:type="spellEnd"/>
+      <w:r>
+        <w:t>__ to a persistent context state that survives across individual steps.</w:t>
+      </w:r>
+    </w:p>
+    <w:p>
+      <w:pPr>
+        <w:numPr>
+          <w:ilvl w:val="0"/>
+          <w:numId w:val="23"/>
+        </w:numPr>
+      </w:pPr>
+      <w:r>
+        <w:rPr>
+          <w:b/>
+          <w:bCs/>
+        </w:rPr>
+        <w:t>Conditional Branching &amp; Webhooks:</w:t>
+      </w:r>
+      <w:r>
+        <w:t xml:space="preserve"> Introduce a condition action type (e.g., if price &gt; threshold) and wire it to trigger external API calls, like Jira ticket creation.</w:t>
+      </w:r>
+    </w:p>
+    <w:p>
+      <w:pPr>
+        <w:rPr>
+          <w:b/>
+          <w:bCs/>
+        </w:rPr>
+      </w:pPr>
+      <w:r>
+        <w:rPr>
+          <w:b/>
+          <w:bCs/>
+        </w:rPr>
+        <w:t>Step 3: UI &amp; Dashboard Expansion (The Interface)</w:t>
+      </w:r>
+    </w:p>
+    <w:p>
+      <w:r>
+        <w:t>With the backend logic running smoothly, we expose these new capabilities to the end-user.</w:t>
+      </w:r>
+    </w:p>
+    <w:p>
+      <w:pPr>
+        <w:numPr>
+          <w:ilvl w:val="0"/>
+          <w:numId w:val="24"/>
+        </w:numPr>
+      </w:pPr>
+      <w:r>
+        <w:rPr>
+          <w:b/>
+          <w:bCs/>
+        </w:rPr>
+        <w:t>Front-End Controls:</w:t>
+      </w:r>
+      <w:r>
+        <w:t xml:space="preserve"> Add configuration menus to your Vue/React SPA to </w:t>
+      </w:r>
+      <w:proofErr w:type="gramStart"/>
+      <w:r>
+        <w:t>manage .env</w:t>
+      </w:r>
+      <w:proofErr w:type="gramEnd"/>
+      <w:r>
+        <w:t xml:space="preserve"> variables and API keys visually.</w:t>
+      </w:r>
+    </w:p>
+    <w:p>
+      <w:pPr>
+        <w:numPr>
+          <w:ilvl w:val="0"/>
+          <w:numId w:val="24"/>
+        </w:numPr>
+      </w:pPr>
+      <w:r>
+        <w:rPr>
+          <w:b/>
+          <w:bCs/>
+        </w:rPr>
+        <w:lastRenderedPageBreak/>
+        <w:t>Live Execution Graph:</w:t>
+      </w:r>
+      <w:r>
+        <w:t xml:space="preserve"> Build a visualization component in the dashboard to track the AI's step-by-step logic, branches, and active variables during a live run.</w:t>
       </w:r>
     </w:p>
     <w:p/>
@@ -3214,6 +3465,304 @@
     </w:lvl>
   </w:abstractNum>
   <w:abstractNum w:abstractNumId="12" w15:restartNumberingAfterBreak="0">
+    <w:nsid w:val="4A41669D"/>
+    <w:multiLevelType w:val="multilevel"/>
+    <w:tmpl w:val="D82CCB92"/>
+    <w:lvl w:ilvl="0">
+      <w:start w:val="1"/>
+      <w:numFmt w:val="bullet"/>
+      <w:lvlText w:val=""/>
+      <w:lvlJc w:val="left"/>
+      <w:pPr>
+        <w:tabs>
+          <w:tab w:val="num" w:pos="720"/>
+        </w:tabs>
+        <w:ind w:left="720" w:hanging="360"/>
+      </w:pPr>
+      <w:rPr>
+        <w:rFonts w:ascii="Symbol" w:hAnsi="Symbol" w:hint="default"/>
+        <w:sz w:val="20"/>
+      </w:rPr>
+    </w:lvl>
+    <w:lvl w:ilvl="1" w:tentative="1">
+      <w:start w:val="1"/>
+      <w:numFmt w:val="bullet"/>
+      <w:lvlText w:val="o"/>
+      <w:lvlJc w:val="left"/>
+      <w:pPr>
+        <w:tabs>
+          <w:tab w:val="num" w:pos="1440"/>
+        </w:tabs>
+        <w:ind w:left="1440" w:hanging="360"/>
+      </w:pPr>
+      <w:rPr>
+        <w:rFonts w:ascii="Courier New" w:hAnsi="Courier New" w:hint="default"/>
+        <w:sz w:val="20"/>
+      </w:rPr>
+    </w:lvl>
+    <w:lvl w:ilvl="2" w:tentative="1">
+      <w:start w:val="1"/>
+      <w:numFmt w:val="bullet"/>
+      <w:lvlText w:val=""/>
+      <w:lvlJc w:val="left"/>
+      <w:pPr>
+        <w:tabs>
+          <w:tab w:val="num" w:pos="2160"/>
+        </w:tabs>
+        <w:ind w:left="2160" w:hanging="360"/>
+      </w:pPr>
+      <w:rPr>
+        <w:rFonts w:ascii="Wingdings" w:hAnsi="Wingdings" w:hint="default"/>
+        <w:sz w:val="20"/>
+      </w:rPr>
+    </w:lvl>
+    <w:lvl w:ilvl="3" w:tentative="1">
+      <w:start w:val="1"/>
+      <w:numFmt w:val="bullet"/>
+      <w:lvlText w:val=""/>
+      <w:lvlJc w:val="left"/>
+      <w:pPr>
+        <w:tabs>
+          <w:tab w:val="num" w:pos="2880"/>
+        </w:tabs>
+        <w:ind w:left="2880" w:hanging="360"/>
+      </w:pPr>
+      <w:rPr>
+        <w:rFonts w:ascii="Wingdings" w:hAnsi="Wingdings" w:hint="default"/>
+        <w:sz w:val="20"/>
+      </w:rPr>
+    </w:lvl>
+    <w:lvl w:ilvl="4" w:tentative="1">
+      <w:start w:val="1"/>
+      <w:numFmt w:val="bullet"/>
+      <w:lvlText w:val=""/>
+      <w:lvlJc w:val="left"/>
+      <w:pPr>
+        <w:tabs>
+          <w:tab w:val="num" w:pos="3600"/>
+        </w:tabs>
+        <w:ind w:left="3600" w:hanging="360"/>
+      </w:pPr>
+      <w:rPr>
+        <w:rFonts w:ascii="Wingdings" w:hAnsi="Wingdings" w:hint="default"/>
+        <w:sz w:val="20"/>
+      </w:rPr>
+    </w:lvl>
+    <w:lvl w:ilvl="5" w:tentative="1">
+      <w:start w:val="1"/>
+      <w:numFmt w:val="bullet"/>
+      <w:lvlText w:val=""/>
+      <w:lvlJc w:val="left"/>
+      <w:pPr>
+        <w:tabs>
+          <w:tab w:val="num" w:pos="4320"/>
+        </w:tabs>
+        <w:ind w:left="4320" w:hanging="360"/>
+      </w:pPr>
+      <w:rPr>
+        <w:rFonts w:ascii="Wingdings" w:hAnsi="Wingdings" w:hint="default"/>
+        <w:sz w:val="20"/>
+      </w:rPr>
+    </w:lvl>
+    <w:lvl w:ilvl="6" w:tentative="1">
+      <w:start w:val="1"/>
+      <w:numFmt w:val="bullet"/>
+      <w:lvlText w:val=""/>
+      <w:lvlJc w:val="left"/>
+      <w:pPr>
+        <w:tabs>
+          <w:tab w:val="num" w:pos="5040"/>
+        </w:tabs>
+        <w:ind w:left="5040" w:hanging="360"/>
+      </w:pPr>
+      <w:rPr>
+        <w:rFonts w:ascii="Wingdings" w:hAnsi="Wingdings" w:hint="default"/>
+        <w:sz w:val="20"/>
+      </w:rPr>
+    </w:lvl>
+    <w:lvl w:ilvl="7" w:tentative="1">
+      <w:start w:val="1"/>
+      <w:numFmt w:val="bullet"/>
+      <w:lvlText w:val=""/>
+      <w:lvlJc w:val="left"/>
+      <w:pPr>
+        <w:tabs>
+          <w:tab w:val="num" w:pos="5760"/>
+        </w:tabs>
+        <w:ind w:left="5760" w:hanging="360"/>
+      </w:pPr>
+      <w:rPr>
+        <w:rFonts w:ascii="Wingdings" w:hAnsi="Wingdings" w:hint="default"/>
+        <w:sz w:val="20"/>
+      </w:rPr>
+    </w:lvl>
+    <w:lvl w:ilvl="8" w:tentative="1">
+      <w:start w:val="1"/>
+      <w:numFmt w:val="bullet"/>
+      <w:lvlText w:val=""/>
+      <w:lvlJc w:val="left"/>
+      <w:pPr>
+        <w:tabs>
+          <w:tab w:val="num" w:pos="6480"/>
+        </w:tabs>
+        <w:ind w:left="6480" w:hanging="360"/>
+      </w:pPr>
+      <w:rPr>
+        <w:rFonts w:ascii="Wingdings" w:hAnsi="Wingdings" w:hint="default"/>
+        <w:sz w:val="20"/>
+      </w:rPr>
+    </w:lvl>
+  </w:abstractNum>
+  <w:abstractNum w:abstractNumId="13" w15:restartNumberingAfterBreak="0">
+    <w:nsid w:val="51A62479"/>
+    <w:multiLevelType w:val="multilevel"/>
+    <w:tmpl w:val="D304C874"/>
+    <w:lvl w:ilvl="0">
+      <w:start w:val="1"/>
+      <w:numFmt w:val="bullet"/>
+      <w:lvlText w:val=""/>
+      <w:lvlJc w:val="left"/>
+      <w:pPr>
+        <w:tabs>
+          <w:tab w:val="num" w:pos="720"/>
+        </w:tabs>
+        <w:ind w:left="720" w:hanging="360"/>
+      </w:pPr>
+      <w:rPr>
+        <w:rFonts w:ascii="Symbol" w:hAnsi="Symbol" w:hint="default"/>
+        <w:sz w:val="20"/>
+      </w:rPr>
+    </w:lvl>
+    <w:lvl w:ilvl="1" w:tentative="1">
+      <w:start w:val="1"/>
+      <w:numFmt w:val="bullet"/>
+      <w:lvlText w:val="o"/>
+      <w:lvlJc w:val="left"/>
+      <w:pPr>
+        <w:tabs>
+          <w:tab w:val="num" w:pos="1440"/>
+        </w:tabs>
+        <w:ind w:left="1440" w:hanging="360"/>
+      </w:pPr>
+      <w:rPr>
+        <w:rFonts w:ascii="Courier New" w:hAnsi="Courier New" w:hint="default"/>
+        <w:sz w:val="20"/>
+      </w:rPr>
+    </w:lvl>
+    <w:lvl w:ilvl="2" w:tentative="1">
+      <w:start w:val="1"/>
+      <w:numFmt w:val="bullet"/>
+      <w:lvlText w:val=""/>
+      <w:lvlJc w:val="left"/>
+      <w:pPr>
+        <w:tabs>
+          <w:tab w:val="num" w:pos="2160"/>
+        </w:tabs>
+        <w:ind w:left="2160" w:hanging="360"/>
+      </w:pPr>
+      <w:rPr>
+        <w:rFonts w:ascii="Wingdings" w:hAnsi="Wingdings" w:hint="default"/>
+        <w:sz w:val="20"/>
+      </w:rPr>
+    </w:lvl>
+    <w:lvl w:ilvl="3" w:tentative="1">
+      <w:start w:val="1"/>
+      <w:numFmt w:val="bullet"/>
+      <w:lvlText w:val=""/>
+      <w:lvlJc w:val="left"/>
+      <w:pPr>
+        <w:tabs>
+          <w:tab w:val="num" w:pos="2880"/>
+        </w:tabs>
+        <w:ind w:left="2880" w:hanging="360"/>
+      </w:pPr>
+      <w:rPr>
+        <w:rFonts w:ascii="Wingdings" w:hAnsi="Wingdings" w:hint="default"/>
+        <w:sz w:val="20"/>
+      </w:rPr>
+    </w:lvl>
+    <w:lvl w:ilvl="4" w:tentative="1">
+      <w:start w:val="1"/>
+      <w:numFmt w:val="bullet"/>
+      <w:lvlText w:val=""/>
+      <w:lvlJc w:val="left"/>
+      <w:pPr>
+        <w:tabs>
+          <w:tab w:val="num" w:pos="3600"/>
+        </w:tabs>
+        <w:ind w:left="3600" w:hanging="360"/>
+      </w:pPr>
+      <w:rPr>
+        <w:rFonts w:ascii="Wingdings" w:hAnsi="Wingdings" w:hint="default"/>
+        <w:sz w:val="20"/>
+      </w:rPr>
+    </w:lvl>
+    <w:lvl w:ilvl="5" w:tentative="1">
+      <w:start w:val="1"/>
+      <w:numFmt w:val="bullet"/>
+      <w:lvlText w:val=""/>
+      <w:lvlJc w:val="left"/>
+      <w:pPr>
+        <w:tabs>
+          <w:tab w:val="num" w:pos="4320"/>
+        </w:tabs>
+        <w:ind w:left="4320" w:hanging="360"/>
+      </w:pPr>
+      <w:rPr>
+        <w:rFonts w:ascii="Wingdings" w:hAnsi="Wingdings" w:hint="default"/>
+        <w:sz w:val="20"/>
+      </w:rPr>
+    </w:lvl>
+    <w:lvl w:ilvl="6" w:tentative="1">
+      <w:start w:val="1"/>
+      <w:numFmt w:val="bullet"/>
+      <w:lvlText w:val=""/>
+      <w:lvlJc w:val="left"/>
+      <w:pPr>
+        <w:tabs>
+          <w:tab w:val="num" w:pos="5040"/>
+        </w:tabs>
+        <w:ind w:left="5040" w:hanging="360"/>
+      </w:pPr>
+      <w:rPr>
+        <w:rFonts w:ascii="Wingdings" w:hAnsi="Wingdings" w:hint="default"/>
+        <w:sz w:val="20"/>
+      </w:rPr>
+    </w:lvl>
+    <w:lvl w:ilvl="7" w:tentative="1">
+      <w:start w:val="1"/>
+      <w:numFmt w:val="bullet"/>
+      <w:lvlText w:val=""/>
+      <w:lvlJc w:val="left"/>
+      <w:pPr>
+        <w:tabs>
+          <w:tab w:val="num" w:pos="5760"/>
+        </w:tabs>
+        <w:ind w:left="5760" w:hanging="360"/>
+      </w:pPr>
+      <w:rPr>
+        <w:rFonts w:ascii="Wingdings" w:hAnsi="Wingdings" w:hint="default"/>
+        <w:sz w:val="20"/>
+      </w:rPr>
+    </w:lvl>
+    <w:lvl w:ilvl="8" w:tentative="1">
+      <w:start w:val="1"/>
+      <w:numFmt w:val="bullet"/>
+      <w:lvlText w:val=""/>
+      <w:lvlJc w:val="left"/>
+      <w:pPr>
+        <w:tabs>
+          <w:tab w:val="num" w:pos="6480"/>
+        </w:tabs>
+        <w:ind w:left="6480" w:hanging="360"/>
+      </w:pPr>
+      <w:rPr>
+        <w:rFonts w:ascii="Wingdings" w:hAnsi="Wingdings" w:hint="default"/>
+        <w:sz w:val="20"/>
+      </w:rPr>
+    </w:lvl>
+  </w:abstractNum>
+  <w:abstractNum w:abstractNumId="14" w15:restartNumberingAfterBreak="0">
     <w:nsid w:val="5B69054E"/>
     <w:multiLevelType w:val="multilevel"/>
     <w:tmpl w:val="4EBE384A"/>
@@ -3362,7 +3911,7 @@
       </w:rPr>
     </w:lvl>
   </w:abstractNum>
-  <w:abstractNum w:abstractNumId="13" w15:restartNumberingAfterBreak="0">
+  <w:abstractNum w:abstractNumId="15" w15:restartNumberingAfterBreak="0">
     <w:nsid w:val="61DD36E6"/>
     <w:multiLevelType w:val="multilevel"/>
     <w:tmpl w:val="8682A43C"/>
@@ -3511,7 +4060,7 @@
       </w:rPr>
     </w:lvl>
   </w:abstractNum>
-  <w:abstractNum w:abstractNumId="14" w15:restartNumberingAfterBreak="0">
+  <w:abstractNum w:abstractNumId="16" w15:restartNumberingAfterBreak="0">
     <w:nsid w:val="65E26350"/>
     <w:multiLevelType w:val="multilevel"/>
     <w:tmpl w:val="5FE69228"/>
@@ -3660,7 +4209,7 @@
       </w:rPr>
     </w:lvl>
   </w:abstractNum>
-  <w:abstractNum w:abstractNumId="15" w15:restartNumberingAfterBreak="0">
+  <w:abstractNum w:abstractNumId="17" w15:restartNumberingAfterBreak="0">
     <w:nsid w:val="73C653C7"/>
     <w:multiLevelType w:val="multilevel"/>
     <w:tmpl w:val="6246A288"/>
@@ -3809,7 +4358,156 @@
       </w:rPr>
     </w:lvl>
   </w:abstractNum>
-  <w:abstractNum w:abstractNumId="16" w15:restartNumberingAfterBreak="0">
+  <w:abstractNum w:abstractNumId="18" w15:restartNumberingAfterBreak="0">
+    <w:nsid w:val="75FA44DE"/>
+    <w:multiLevelType w:val="multilevel"/>
+    <w:tmpl w:val="64A6BE7A"/>
+    <w:lvl w:ilvl="0">
+      <w:start w:val="1"/>
+      <w:numFmt w:val="bullet"/>
+      <w:lvlText w:val=""/>
+      <w:lvlJc w:val="left"/>
+      <w:pPr>
+        <w:tabs>
+          <w:tab w:val="num" w:pos="720"/>
+        </w:tabs>
+        <w:ind w:left="720" w:hanging="360"/>
+      </w:pPr>
+      <w:rPr>
+        <w:rFonts w:ascii="Symbol" w:hAnsi="Symbol" w:hint="default"/>
+        <w:sz w:val="20"/>
+      </w:rPr>
+    </w:lvl>
+    <w:lvl w:ilvl="1" w:tentative="1">
+      <w:start w:val="1"/>
+      <w:numFmt w:val="bullet"/>
+      <w:lvlText w:val="o"/>
+      <w:lvlJc w:val="left"/>
+      <w:pPr>
+        <w:tabs>
+          <w:tab w:val="num" w:pos="1440"/>
+        </w:tabs>
+        <w:ind w:left="1440" w:hanging="360"/>
+      </w:pPr>
+      <w:rPr>
+        <w:rFonts w:ascii="Courier New" w:hAnsi="Courier New" w:hint="default"/>
+        <w:sz w:val="20"/>
+      </w:rPr>
+    </w:lvl>
+    <w:lvl w:ilvl="2" w:tentative="1">
+      <w:start w:val="1"/>
+      <w:numFmt w:val="bullet"/>
+      <w:lvlText w:val=""/>
+      <w:lvlJc w:val="left"/>
+      <w:pPr>
+        <w:tabs>
+          <w:tab w:val="num" w:pos="2160"/>
+        </w:tabs>
+        <w:ind w:left="2160" w:hanging="360"/>
+      </w:pPr>
+      <w:rPr>
+        <w:rFonts w:ascii="Wingdings" w:hAnsi="Wingdings" w:hint="default"/>
+        <w:sz w:val="20"/>
+      </w:rPr>
+    </w:lvl>
+    <w:lvl w:ilvl="3" w:tentative="1">
+      <w:start w:val="1"/>
+      <w:numFmt w:val="bullet"/>
+      <w:lvlText w:val=""/>
+      <w:lvlJc w:val="left"/>
+      <w:pPr>
+        <w:tabs>
+          <w:tab w:val="num" w:pos="2880"/>
+        </w:tabs>
+        <w:ind w:left="2880" w:hanging="360"/>
+      </w:pPr>
+      <w:rPr>
+        <w:rFonts w:ascii="Wingdings" w:hAnsi="Wingdings" w:hint="default"/>
+        <w:sz w:val="20"/>
+      </w:rPr>
+    </w:lvl>
+    <w:lvl w:ilvl="4" w:tentative="1">
+      <w:start w:val="1"/>
+      <w:numFmt w:val="bullet"/>
+      <w:lvlText w:val=""/>
+      <w:lvlJc w:val="left"/>
+      <w:pPr>
+        <w:tabs>
+          <w:tab w:val="num" w:pos="3600"/>
+        </w:tabs>
+        <w:ind w:left="3600" w:hanging="360"/>
+      </w:pPr>
+      <w:rPr>
+        <w:rFonts w:ascii="Wingdings" w:hAnsi="Wingdings" w:hint="default"/>
+        <w:sz w:val="20"/>
+      </w:rPr>
+    </w:lvl>
+    <w:lvl w:ilvl="5" w:tentative="1">
+      <w:start w:val="1"/>
+      <w:numFmt w:val="bullet"/>
+      <w:lvlText w:val=""/>
+      <w:lvlJc w:val="left"/>
+      <w:pPr>
+        <w:tabs>
+          <w:tab w:val="num" w:pos="4320"/>
+        </w:tabs>
+        <w:ind w:left="4320" w:hanging="360"/>
+      </w:pPr>
+      <w:rPr>
+        <w:rFonts w:ascii="Wingdings" w:hAnsi="Wingdings" w:hint="default"/>
+        <w:sz w:val="20"/>
+      </w:rPr>
+    </w:lvl>
+    <w:lvl w:ilvl="6" w:tentative="1">
+      <w:start w:val="1"/>
+      <w:numFmt w:val="bullet"/>
+      <w:lvlText w:val=""/>
+      <w:lvlJc w:val="left"/>
+      <w:pPr>
+        <w:tabs>
+          <w:tab w:val="num" w:pos="5040"/>
+        </w:tabs>
+        <w:ind w:left="5040" w:hanging="360"/>
+      </w:pPr>
+      <w:rPr>
+        <w:rFonts w:ascii="Wingdings" w:hAnsi="Wingdings" w:hint="default"/>
+        <w:sz w:val="20"/>
+      </w:rPr>
+    </w:lvl>
+    <w:lvl w:ilvl="7" w:tentative="1">
+      <w:start w:val="1"/>
+      <w:numFmt w:val="bullet"/>
+      <w:lvlText w:val=""/>
+      <w:lvlJc w:val="left"/>
+      <w:pPr>
+        <w:tabs>
+          <w:tab w:val="num" w:pos="5760"/>
+        </w:tabs>
+        <w:ind w:left="5760" w:hanging="360"/>
+      </w:pPr>
+      <w:rPr>
+        <w:rFonts w:ascii="Wingdings" w:hAnsi="Wingdings" w:hint="default"/>
+        <w:sz w:val="20"/>
+      </w:rPr>
+    </w:lvl>
+    <w:lvl w:ilvl="8" w:tentative="1">
+      <w:start w:val="1"/>
+      <w:numFmt w:val="bullet"/>
+      <w:lvlText w:val=""/>
+      <w:lvlJc w:val="left"/>
+      <w:pPr>
+        <w:tabs>
+          <w:tab w:val="num" w:pos="6480"/>
+        </w:tabs>
+        <w:ind w:left="6480" w:hanging="360"/>
+      </w:pPr>
+      <w:rPr>
+        <w:rFonts w:ascii="Wingdings" w:hAnsi="Wingdings" w:hint="default"/>
+        <w:sz w:val="20"/>
+      </w:rPr>
+    </w:lvl>
+  </w:abstractNum>
+  <w:abstractNum w:abstractNumId="19" w15:restartNumberingAfterBreak="0">
     <w:nsid w:val="76932471"/>
     <w:multiLevelType w:val="multilevel"/>
     <w:tmpl w:val="761683DA"/>
@@ -3958,7 +4656,7 @@
       </w:rPr>
     </w:lvl>
   </w:abstractNum>
-  <w:abstractNum w:abstractNumId="17" w15:restartNumberingAfterBreak="0">
+  <w:abstractNum w:abstractNumId="20" w15:restartNumberingAfterBreak="0">
     <w:nsid w:val="76B24B17"/>
     <w:multiLevelType w:val="multilevel"/>
     <w:tmpl w:val="DD161820"/>
@@ -4107,7 +4805,7 @@
       </w:rPr>
     </w:lvl>
   </w:abstractNum>
-  <w:abstractNum w:abstractNumId="18" w15:restartNumberingAfterBreak="0">
+  <w:abstractNum w:abstractNumId="21" w15:restartNumberingAfterBreak="0">
     <w:nsid w:val="7763579A"/>
     <w:multiLevelType w:val="multilevel"/>
     <w:tmpl w:val="1460FF0A"/>
@@ -4256,7 +4954,7 @@
       </w:rPr>
     </w:lvl>
   </w:abstractNum>
-  <w:abstractNum w:abstractNumId="19" w15:restartNumberingAfterBreak="0">
+  <w:abstractNum w:abstractNumId="22" w15:restartNumberingAfterBreak="0">
     <w:nsid w:val="787C7A5D"/>
     <w:multiLevelType w:val="multilevel"/>
     <w:tmpl w:val="362ED21C"/>
@@ -4405,7 +5103,7 @@
       </w:rPr>
     </w:lvl>
   </w:abstractNum>
-  <w:abstractNum w:abstractNumId="20" w15:restartNumberingAfterBreak="0">
+  <w:abstractNum w:abstractNumId="23" w15:restartNumberingAfterBreak="0">
     <w:nsid w:val="7F25014E"/>
     <w:multiLevelType w:val="multilevel"/>
     <w:tmpl w:val="87788868"/>
@@ -4558,16 +5256,16 @@
     <w:abstractNumId w:val="6"/>
   </w:num>
   <w:num w:numId="2" w16cid:durableId="2102290164">
-    <w:abstractNumId w:val="13"/>
+    <w:abstractNumId w:val="15"/>
   </w:num>
   <w:num w:numId="3" w16cid:durableId="1460339884">
-    <w:abstractNumId w:val="14"/>
+    <w:abstractNumId w:val="16"/>
   </w:num>
   <w:num w:numId="4" w16cid:durableId="1739018508">
     <w:abstractNumId w:val="5"/>
   </w:num>
   <w:num w:numId="5" w16cid:durableId="896282314">
-    <w:abstractNumId w:val="20"/>
+    <w:abstractNumId w:val="23"/>
   </w:num>
   <w:num w:numId="6" w16cid:durableId="1360743008">
     <w:abstractNumId w:val="11"/>
@@ -4585,28 +5283,28 @@
     <w:abstractNumId w:val="8"/>
   </w:num>
   <w:num w:numId="11" w16cid:durableId="1846163322">
-    <w:abstractNumId w:val="15"/>
+    <w:abstractNumId w:val="17"/>
   </w:num>
   <w:num w:numId="12" w16cid:durableId="331952524">
     <w:abstractNumId w:val="3"/>
   </w:num>
   <w:num w:numId="13" w16cid:durableId="1658921630">
-    <w:abstractNumId w:val="17"/>
+    <w:abstractNumId w:val="20"/>
   </w:num>
   <w:num w:numId="14" w16cid:durableId="1430009259">
-    <w:abstractNumId w:val="18"/>
+    <w:abstractNumId w:val="21"/>
   </w:num>
   <w:num w:numId="15" w16cid:durableId="713771419">
     <w:abstractNumId w:val="1"/>
   </w:num>
   <w:num w:numId="16" w16cid:durableId="1755011840">
-    <w:abstractNumId w:val="16"/>
+    <w:abstractNumId w:val="19"/>
   </w:num>
   <w:num w:numId="17" w16cid:durableId="1681931220">
-    <w:abstractNumId w:val="12"/>
+    <w:abstractNumId w:val="14"/>
   </w:num>
   <w:num w:numId="18" w16cid:durableId="221062535">
-    <w:abstractNumId w:val="19"/>
+    <w:abstractNumId w:val="22"/>
   </w:num>
   <w:num w:numId="19" w16cid:durableId="1524127589">
     <w:abstractNumId w:val="7"/>
@@ -4616,6 +5314,15 @@
   </w:num>
   <w:num w:numId="21" w16cid:durableId="1579055599">
     <w:abstractNumId w:val="4"/>
+  </w:num>
+  <w:num w:numId="22" w16cid:durableId="258293515">
+    <w:abstractNumId w:val="12"/>
+  </w:num>
+  <w:num w:numId="23" w16cid:durableId="1232472367">
+    <w:abstractNumId w:val="13"/>
+  </w:num>
+  <w:num w:numId="24" w16cid:durableId="1701780755">
+    <w:abstractNumId w:val="18"/>
   </w:num>
 </w:numbering>
 </file>

</xml_diff>

<commit_message>
Phase 12 - JS Telemetry Injector (Shield 2: DOM Mutation Verification)
</commit_message>
<xml_diff>
--- a/WEBAI_AUTOMATION/planning.docx
+++ b/WEBAI_AUTOMATION/planning.docx
@@ -1650,6 +1650,9 @@
           <w:ilvl w:val="0"/>
           <w:numId w:val="24"/>
         </w:numPr>
+        <w:pBdr>
+          <w:bottom w:val="single" w:sz="12" w:space="1" w:color="auto"/>
+        </w:pBdr>
       </w:pPr>
       <w:r>
         <w:rPr>
@@ -1661,6 +1664,328 @@
       </w:r>
       <w:r>
         <w:t xml:space="preserve"> Build a visualization component in the dashboard to track the AI's step-by-step logic, branches, and active variables during a live run.</w:t>
+      </w:r>
+    </w:p>
+    <w:p/>
+    <w:p>
+      <w:pPr>
+        <w:rPr>
+          <w:b/>
+          <w:bCs/>
+        </w:rPr>
+      </w:pPr>
+      <w:r>
+        <w:rPr>
+          <w:b/>
+          <w:bCs/>
+        </w:rPr>
+        <w:t>Welcome to Phase 12</w:t>
+      </w:r>
+    </w:p>
+    <w:p>
+      <w:r>
+        <w:t>With that technical debt cleared, we can jump straight into the advanced telemetry and verification systems. Which of the two components do you want to tackle first?</w:t>
+      </w:r>
+    </w:p>
+    <w:p>
+      <w:pPr>
+        <w:numPr>
+          <w:ilvl w:val="0"/>
+          <w:numId w:val="25"/>
+        </w:numPr>
+      </w:pPr>
+      <w:r>
+        <w:rPr>
+          <w:b/>
+          <w:bCs/>
+        </w:rPr>
+        <w:t>Option A: JS Telemetry Injector (Observer Mode)</w:t>
+      </w:r>
+      <w:r>
+        <w:t xml:space="preserve"> We write the JavaScript payload that gets injected when the HITL panel pauses the AI. It will secretly record the exact CSS path, XPath, and text of whatever the human clicks (using the capture phase to bypass </w:t>
+      </w:r>
+      <w:proofErr w:type="spellStart"/>
+      <w:r>
+        <w:t>stopPropagation</w:t>
+      </w:r>
+      <w:proofErr w:type="spellEnd"/>
+      <w:r>
+        <w:t xml:space="preserve"> SPA traps). When the user clicks "Resume", we feed that exact data back to the </w:t>
+      </w:r>
+      <w:proofErr w:type="gramStart"/>
+      <w:r>
+        <w:t>LLM</w:t>
+      </w:r>
+      <w:proofErr w:type="gramEnd"/>
+      <w:r>
+        <w:t xml:space="preserve"> so it learns instantly.</w:t>
+      </w:r>
+    </w:p>
+    <w:p>
+      <w:pPr>
+        <w:numPr>
+          <w:ilvl w:val="0"/>
+          <w:numId w:val="25"/>
+        </w:numPr>
+      </w:pPr>
+      <w:r>
+        <w:rPr>
+          <w:b/>
+          <w:bCs/>
+        </w:rPr>
+        <w:t>Option B: Speculative Execution &amp; Backtracking</w:t>
+      </w:r>
+      <w:r>
+        <w:t xml:space="preserve"> We design the prompt instructions and tool structure to give the LLM the </w:t>
+      </w:r>
+      <w:proofErr w:type="spellStart"/>
+      <w:proofErr w:type="gramStart"/>
+      <w:r>
+        <w:t>page.go</w:t>
+      </w:r>
+      <w:proofErr w:type="gramEnd"/>
+      <w:r>
+        <w:t>_</w:t>
+      </w:r>
+      <w:proofErr w:type="gramStart"/>
+      <w:r>
+        <w:t>back</w:t>
+      </w:r>
+      <w:proofErr w:type="spellEnd"/>
+      <w:r>
+        <w:t>(</w:t>
+      </w:r>
+      <w:proofErr w:type="gramEnd"/>
+      <w:r>
+        <w:t xml:space="preserve">) command. We'll build the logic for how the AI takes a DOM snapshot, clicks a speculative link, evaluates if the state </w:t>
+      </w:r>
+      <w:proofErr w:type="gramStart"/>
+      <w:r>
+        <w:t>actually changed</w:t>
+      </w:r>
+      <w:proofErr w:type="gramEnd"/>
+      <w:r>
+        <w:t>, and rolls back if it realizes it went down the wrong path.</w:t>
+      </w:r>
+    </w:p>
+    <w:p>
+      <w:pPr>
+        <w:rPr>
+          <w:b/>
+          <w:bCs/>
+        </w:rPr>
+      </w:pPr>
+      <w:r>
+        <w:rPr>
+          <w:b/>
+          <w:bCs/>
+        </w:rPr>
+        <w:t>1. Smart JS Semantic Filtering (The First Shield)</w:t>
+      </w:r>
+    </w:p>
+    <w:p>
+      <w:r>
+        <w:t xml:space="preserve">Instead of recording every </w:t>
+      </w:r>
+      <w:proofErr w:type="spellStart"/>
+      <w:r>
+        <w:t>mousedown</w:t>
+      </w:r>
+      <w:proofErr w:type="spellEnd"/>
+      <w:r>
+        <w:t xml:space="preserve"> event blindly, our injected JavaScript listener should evaluate the clicked element's semantic value on the fly.</w:t>
+      </w:r>
+    </w:p>
+    <w:p>
+      <w:pPr>
+        <w:numPr>
+          <w:ilvl w:val="0"/>
+          <w:numId w:val="26"/>
+        </w:numPr>
+      </w:pPr>
+      <w:r>
+        <w:rPr>
+          <w:b/>
+          <w:bCs/>
+        </w:rPr>
+        <w:t>Ignore Dead Space:</w:t>
+      </w:r>
+      <w:r>
+        <w:t xml:space="preserve"> Automatically discard clicks on &lt;body&gt;, &lt;html&gt;, or empty &lt;div&gt; and &lt;span&gt; tags that have no text content and no explicit cursor: pointer styles.</w:t>
+      </w:r>
+    </w:p>
+    <w:p>
+      <w:pPr>
+        <w:numPr>
+          <w:ilvl w:val="0"/>
+          <w:numId w:val="26"/>
+        </w:numPr>
+      </w:pPr>
+      <w:r>
+        <w:rPr>
+          <w:b/>
+          <w:bCs/>
+        </w:rPr>
+        <w:t>Capture Interactive Elements:</w:t>
+      </w:r>
+      <w:r>
+        <w:t xml:space="preserve"> Only record clicks on known interactive tags (&lt;</w:t>
+      </w:r>
+      <w:proofErr w:type="gramStart"/>
+      <w:r>
+        <w:t>a&gt;, &lt;button</w:t>
+      </w:r>
+      <w:proofErr w:type="gramEnd"/>
+      <w:r>
+        <w:t>&gt;, &lt;input&gt;, [role="button"], &lt;select&gt;) or elements that contain significant text.</w:t>
+      </w:r>
+    </w:p>
+    <w:p>
+      <w:pPr>
+        <w:rPr>
+          <w:b/>
+          <w:bCs/>
+        </w:rPr>
+      </w:pPr>
+      <w:r>
+        <w:rPr>
+          <w:b/>
+          <w:bCs/>
+        </w:rPr>
+        <w:t>2. DOM Mutation Verification (The Gold Standard)</w:t>
+      </w:r>
+    </w:p>
+    <w:p>
+      <w:r>
+        <w:t xml:space="preserve">Sometimes a user clicks a "blank" space to close a modal overlay or a dropdown menu. How does the bot know if a click on a seemingly dead &lt;div&gt; was </w:t>
+      </w:r>
+      <w:proofErr w:type="gramStart"/>
+      <w:r>
+        <w:t>actually important</w:t>
+      </w:r>
+      <w:proofErr w:type="gramEnd"/>
+      <w:r>
+        <w:t>?</w:t>
+      </w:r>
+    </w:p>
+    <w:p>
+      <w:pPr>
+        <w:numPr>
+          <w:ilvl w:val="0"/>
+          <w:numId w:val="27"/>
+        </w:numPr>
+      </w:pPr>
+      <w:r>
+        <w:rPr>
+          <w:b/>
+          <w:bCs/>
+        </w:rPr>
+        <w:t>The Solution:</w:t>
+      </w:r>
+      <w:r>
+        <w:t xml:space="preserve"> We can temporarily attach a </w:t>
+      </w:r>
+      <w:proofErr w:type="spellStart"/>
+      <w:r>
+        <w:t>MutationObserver</w:t>
+      </w:r>
+      <w:proofErr w:type="spellEnd"/>
+      <w:r>
+        <w:t xml:space="preserve"> to the document during the Observer Mode.</w:t>
+      </w:r>
+    </w:p>
+    <w:p>
+      <w:pPr>
+        <w:numPr>
+          <w:ilvl w:val="0"/>
+          <w:numId w:val="27"/>
+        </w:numPr>
+      </w:pPr>
+      <w:r>
+        <w:lastRenderedPageBreak/>
+        <w:t xml:space="preserve">If a click results in the DOM changing (nodes added/removed) or the URL changing within 500ms, we flag it as a </w:t>
+      </w:r>
+      <w:r>
+        <w:rPr>
+          <w:b/>
+          <w:bCs/>
+        </w:rPr>
+        <w:t>State-Changing Click</w:t>
+      </w:r>
+      <w:r>
+        <w:t>. If the user clicks empty space and nothing happens, the JS throws it away as noise.</w:t>
+      </w:r>
+    </w:p>
+    <w:p>
+      <w:pPr>
+        <w:rPr>
+          <w:b/>
+          <w:bCs/>
+        </w:rPr>
+      </w:pPr>
+      <w:r>
+        <w:rPr>
+          <w:b/>
+          <w:bCs/>
+        </w:rPr>
+        <w:t>3. Voice-to-Action Correlation (LLM Intent Matching)</w:t>
+      </w:r>
+    </w:p>
+    <w:p>
+      <w:r>
+        <w:t xml:space="preserve">When the user clicks "Resume AI," we pass the filtered action log alongside their voice transcription (e.g., </w:t>
+      </w:r>
+      <w:r>
+        <w:rPr>
+          <w:i/>
+          <w:iCs/>
+        </w:rPr>
+        <w:t>"I clicked the second checkout button"</w:t>
+      </w:r>
+      <w:r>
+        <w:t>).</w:t>
+      </w:r>
+    </w:p>
+    <w:p>
+      <w:pPr>
+        <w:numPr>
+          <w:ilvl w:val="0"/>
+          <w:numId w:val="28"/>
+        </w:numPr>
+      </w:pPr>
+      <w:r>
+        <w:t>We can update the LLM prompt to instruct it to map the transcribed audio intent to the telemetry log.</w:t>
+      </w:r>
+    </w:p>
+    <w:p>
+      <w:pPr>
+        <w:numPr>
+          <w:ilvl w:val="0"/>
+          <w:numId w:val="28"/>
+        </w:numPr>
+      </w:pPr>
+      <w:r>
+        <w:t>If the telemetry captured three clicks, but the final click was on an element with the text "Checkout," the LLM will intelligently discard the first two as browsing behavior.</w:t>
+      </w:r>
+    </w:p>
+    <w:p>
+      <w:pPr>
+        <w:rPr>
+          <w:b/>
+          <w:bCs/>
+        </w:rPr>
+      </w:pPr>
+      <w:r>
+        <w:rPr>
+          <w:b/>
+          <w:bCs/>
+        </w:rPr>
+        <w:t>How to Proceed</w:t>
+      </w:r>
+    </w:p>
+    <w:p>
+      <w:r>
+        <w:t>By combining JS filtering with LLM reasoning, we ensure the bot only learns from the actual successful action.</w:t>
       </w:r>
     </w:p>
     <w:p/>
@@ -1677,6 +2002,155 @@
 <file path=word/numbering.xml><?xml version="1.0" encoding="utf-8"?>
 <w:numbering xmlns:wpc="http://schemas.microsoft.com/office/word/2010/wordprocessingCanvas" xmlns:cx="http://schemas.microsoft.com/office/drawing/2014/chartex" xmlns:cx1="http://schemas.microsoft.com/office/drawing/2015/9/8/chartex" xmlns:cx2="http://schemas.microsoft.com/office/drawing/2015/10/21/chartex" xmlns:cx3="http://schemas.microsoft.com/office/drawing/2016/5/9/chartex" xmlns:cx4="http://schemas.microsoft.com/office/drawing/2016/5/10/chartex" xmlns:cx5="http://schemas.microsoft.com/office/drawing/2016/5/11/chartex" xmlns:cx6="http://schemas.microsoft.com/office/drawing/2016/5/12/chartex" xmlns:cx7="http://schemas.microsoft.com/office/drawing/2016/5/13/chartex" xmlns:cx8="http://schemas.microsoft.com/office/drawing/2016/5/14/chartex" xmlns:mc="http://schemas.openxmlformats.org/markup-compatibility/2006" xmlns:aink="http://schemas.microsoft.com/office/drawing/2016/ink" xmlns:am3d="http://schemas.microsoft.com/office/drawing/2017/model3d" xmlns:o="urn:schemas-microsoft-com:office:office" xmlns:oel="http://schemas.microsoft.com/office/2019/extlst" xmlns:r="http://schemas.openxmlformats.org/officeDocument/2006/relationships" xmlns:m="http://schemas.openxmlformats.org/officeDocument/2006/math" xmlns:v="urn:schemas-microsoft-com:vml" xmlns:wp14="http://schemas.microsoft.com/office/word/2010/wordprocessingDrawing" xmlns:wp="http://schemas.openxmlformats.org/drawingml/2006/wordprocessingDrawing" xmlns:w10="urn:schemas-microsoft-com:office:word" xmlns:w="http://schemas.openxmlformats.org/wordprocessingml/2006/main" xmlns:w14="http://schemas.microsoft.com/office/word/2010/wordml" xmlns:w15="http://schemas.microsoft.com/office/word/2012/wordml" xmlns:w16cex="http://schemas.microsoft.com/office/word/2018/wordml/cex" xmlns:w16cid="http://schemas.microsoft.com/office/word/2016/wordml/cid" xmlns:w16="http://schemas.microsoft.com/office/word/2018/wordml" xmlns:w16du="http://schemas.microsoft.com/office/word/2023/wordml/word16du" xmlns:w16sdtdh="http://schemas.microsoft.com/office/word/2020/wordml/sdtdatahash" xmlns:w16sdtfl="http://schemas.microsoft.com/office/word/2024/wordml/sdtformatlock" xmlns:w16se="http://schemas.microsoft.com/office/word/2015/wordml/symex" xmlns:wpg="http://schemas.microsoft.com/office/word/2010/wordprocessingGroup" xmlns:wpi="http://schemas.microsoft.com/office/word/2010/wordprocessingInk" xmlns:wne="http://schemas.microsoft.com/office/word/2006/wordml" xmlns:wps="http://schemas.microsoft.com/office/word/2010/wordprocessingShape" mc:Ignorable="w14 w15 w16se w16cid w16 w16cex w16sdtdh w16sdtfl w16du wp14">
   <w:abstractNum w:abstractNumId="0" w15:restartNumberingAfterBreak="0">
+    <w:nsid w:val="01C62A62"/>
+    <w:multiLevelType w:val="multilevel"/>
+    <w:tmpl w:val="449C9622"/>
+    <w:lvl w:ilvl="0">
+      <w:start w:val="1"/>
+      <w:numFmt w:val="bullet"/>
+      <w:lvlText w:val=""/>
+      <w:lvlJc w:val="left"/>
+      <w:pPr>
+        <w:tabs>
+          <w:tab w:val="num" w:pos="720"/>
+        </w:tabs>
+        <w:ind w:left="720" w:hanging="360"/>
+      </w:pPr>
+      <w:rPr>
+        <w:rFonts w:ascii="Symbol" w:hAnsi="Symbol" w:hint="default"/>
+        <w:sz w:val="20"/>
+      </w:rPr>
+    </w:lvl>
+    <w:lvl w:ilvl="1" w:tentative="1">
+      <w:start w:val="1"/>
+      <w:numFmt w:val="bullet"/>
+      <w:lvlText w:val="o"/>
+      <w:lvlJc w:val="left"/>
+      <w:pPr>
+        <w:tabs>
+          <w:tab w:val="num" w:pos="1440"/>
+        </w:tabs>
+        <w:ind w:left="1440" w:hanging="360"/>
+      </w:pPr>
+      <w:rPr>
+        <w:rFonts w:ascii="Courier New" w:hAnsi="Courier New" w:hint="default"/>
+        <w:sz w:val="20"/>
+      </w:rPr>
+    </w:lvl>
+    <w:lvl w:ilvl="2" w:tentative="1">
+      <w:start w:val="1"/>
+      <w:numFmt w:val="bullet"/>
+      <w:lvlText w:val=""/>
+      <w:lvlJc w:val="left"/>
+      <w:pPr>
+        <w:tabs>
+          <w:tab w:val="num" w:pos="2160"/>
+        </w:tabs>
+        <w:ind w:left="2160" w:hanging="360"/>
+      </w:pPr>
+      <w:rPr>
+        <w:rFonts w:ascii="Wingdings" w:hAnsi="Wingdings" w:hint="default"/>
+        <w:sz w:val="20"/>
+      </w:rPr>
+    </w:lvl>
+    <w:lvl w:ilvl="3" w:tentative="1">
+      <w:start w:val="1"/>
+      <w:numFmt w:val="bullet"/>
+      <w:lvlText w:val=""/>
+      <w:lvlJc w:val="left"/>
+      <w:pPr>
+        <w:tabs>
+          <w:tab w:val="num" w:pos="2880"/>
+        </w:tabs>
+        <w:ind w:left="2880" w:hanging="360"/>
+      </w:pPr>
+      <w:rPr>
+        <w:rFonts w:ascii="Wingdings" w:hAnsi="Wingdings" w:hint="default"/>
+        <w:sz w:val="20"/>
+      </w:rPr>
+    </w:lvl>
+    <w:lvl w:ilvl="4" w:tentative="1">
+      <w:start w:val="1"/>
+      <w:numFmt w:val="bullet"/>
+      <w:lvlText w:val=""/>
+      <w:lvlJc w:val="left"/>
+      <w:pPr>
+        <w:tabs>
+          <w:tab w:val="num" w:pos="3600"/>
+        </w:tabs>
+        <w:ind w:left="3600" w:hanging="360"/>
+      </w:pPr>
+      <w:rPr>
+        <w:rFonts w:ascii="Wingdings" w:hAnsi="Wingdings" w:hint="default"/>
+        <w:sz w:val="20"/>
+      </w:rPr>
+    </w:lvl>
+    <w:lvl w:ilvl="5" w:tentative="1">
+      <w:start w:val="1"/>
+      <w:numFmt w:val="bullet"/>
+      <w:lvlText w:val=""/>
+      <w:lvlJc w:val="left"/>
+      <w:pPr>
+        <w:tabs>
+          <w:tab w:val="num" w:pos="4320"/>
+        </w:tabs>
+        <w:ind w:left="4320" w:hanging="360"/>
+      </w:pPr>
+      <w:rPr>
+        <w:rFonts w:ascii="Wingdings" w:hAnsi="Wingdings" w:hint="default"/>
+        <w:sz w:val="20"/>
+      </w:rPr>
+    </w:lvl>
+    <w:lvl w:ilvl="6" w:tentative="1">
+      <w:start w:val="1"/>
+      <w:numFmt w:val="bullet"/>
+      <w:lvlText w:val=""/>
+      <w:lvlJc w:val="left"/>
+      <w:pPr>
+        <w:tabs>
+          <w:tab w:val="num" w:pos="5040"/>
+        </w:tabs>
+        <w:ind w:left="5040" w:hanging="360"/>
+      </w:pPr>
+      <w:rPr>
+        <w:rFonts w:ascii="Wingdings" w:hAnsi="Wingdings" w:hint="default"/>
+        <w:sz w:val="20"/>
+      </w:rPr>
+    </w:lvl>
+    <w:lvl w:ilvl="7" w:tentative="1">
+      <w:start w:val="1"/>
+      <w:numFmt w:val="bullet"/>
+      <w:lvlText w:val=""/>
+      <w:lvlJc w:val="left"/>
+      <w:pPr>
+        <w:tabs>
+          <w:tab w:val="num" w:pos="5760"/>
+        </w:tabs>
+        <w:ind w:left="5760" w:hanging="360"/>
+      </w:pPr>
+      <w:rPr>
+        <w:rFonts w:ascii="Wingdings" w:hAnsi="Wingdings" w:hint="default"/>
+        <w:sz w:val="20"/>
+      </w:rPr>
+    </w:lvl>
+    <w:lvl w:ilvl="8" w:tentative="1">
+      <w:start w:val="1"/>
+      <w:numFmt w:val="bullet"/>
+      <w:lvlText w:val=""/>
+      <w:lvlJc w:val="left"/>
+      <w:pPr>
+        <w:tabs>
+          <w:tab w:val="num" w:pos="6480"/>
+        </w:tabs>
+        <w:ind w:left="6480" w:hanging="360"/>
+      </w:pPr>
+      <w:rPr>
+        <w:rFonts w:ascii="Wingdings" w:hAnsi="Wingdings" w:hint="default"/>
+        <w:sz w:val="20"/>
+      </w:rPr>
+    </w:lvl>
+  </w:abstractNum>
+  <w:abstractNum w:abstractNumId="1" w15:restartNumberingAfterBreak="0">
     <w:nsid w:val="0D66217E"/>
     <w:multiLevelType w:val="multilevel"/>
     <w:tmpl w:val="36AA8C30"/>
@@ -1825,7 +2299,7 @@
       </w:rPr>
     </w:lvl>
   </w:abstractNum>
-  <w:abstractNum w:abstractNumId="1" w15:restartNumberingAfterBreak="0">
+  <w:abstractNum w:abstractNumId="2" w15:restartNumberingAfterBreak="0">
     <w:nsid w:val="0DA10090"/>
     <w:multiLevelType w:val="multilevel"/>
     <w:tmpl w:val="6512DB58"/>
@@ -1974,7 +2448,7 @@
       </w:rPr>
     </w:lvl>
   </w:abstractNum>
-  <w:abstractNum w:abstractNumId="2" w15:restartNumberingAfterBreak="0">
+  <w:abstractNum w:abstractNumId="3" w15:restartNumberingAfterBreak="0">
     <w:nsid w:val="0F7C3802"/>
     <w:multiLevelType w:val="multilevel"/>
     <w:tmpl w:val="AA0E7CE0"/>
@@ -2123,7 +2597,7 @@
       </w:rPr>
     </w:lvl>
   </w:abstractNum>
-  <w:abstractNum w:abstractNumId="3" w15:restartNumberingAfterBreak="0">
+  <w:abstractNum w:abstractNumId="4" w15:restartNumberingAfterBreak="0">
     <w:nsid w:val="10D32AA1"/>
     <w:multiLevelType w:val="multilevel"/>
     <w:tmpl w:val="2EEEEF4E"/>
@@ -2272,7 +2746,7 @@
       </w:rPr>
     </w:lvl>
   </w:abstractNum>
-  <w:abstractNum w:abstractNumId="4" w15:restartNumberingAfterBreak="0">
+  <w:abstractNum w:abstractNumId="5" w15:restartNumberingAfterBreak="0">
     <w:nsid w:val="14D73B6C"/>
     <w:multiLevelType w:val="multilevel"/>
     <w:tmpl w:val="C3566F56"/>
@@ -2421,7 +2895,156 @@
       </w:rPr>
     </w:lvl>
   </w:abstractNum>
-  <w:abstractNum w:abstractNumId="5" w15:restartNumberingAfterBreak="0">
+  <w:abstractNum w:abstractNumId="6" w15:restartNumberingAfterBreak="0">
+    <w:nsid w:val="179C630A"/>
+    <w:multiLevelType w:val="multilevel"/>
+    <w:tmpl w:val="871CB116"/>
+    <w:lvl w:ilvl="0">
+      <w:start w:val="1"/>
+      <w:numFmt w:val="bullet"/>
+      <w:lvlText w:val=""/>
+      <w:lvlJc w:val="left"/>
+      <w:pPr>
+        <w:tabs>
+          <w:tab w:val="num" w:pos="720"/>
+        </w:tabs>
+        <w:ind w:left="720" w:hanging="360"/>
+      </w:pPr>
+      <w:rPr>
+        <w:rFonts w:ascii="Symbol" w:hAnsi="Symbol" w:hint="default"/>
+        <w:sz w:val="20"/>
+      </w:rPr>
+    </w:lvl>
+    <w:lvl w:ilvl="1" w:tentative="1">
+      <w:start w:val="1"/>
+      <w:numFmt w:val="bullet"/>
+      <w:lvlText w:val="o"/>
+      <w:lvlJc w:val="left"/>
+      <w:pPr>
+        <w:tabs>
+          <w:tab w:val="num" w:pos="1440"/>
+        </w:tabs>
+        <w:ind w:left="1440" w:hanging="360"/>
+      </w:pPr>
+      <w:rPr>
+        <w:rFonts w:ascii="Courier New" w:hAnsi="Courier New" w:hint="default"/>
+        <w:sz w:val="20"/>
+      </w:rPr>
+    </w:lvl>
+    <w:lvl w:ilvl="2" w:tentative="1">
+      <w:start w:val="1"/>
+      <w:numFmt w:val="bullet"/>
+      <w:lvlText w:val=""/>
+      <w:lvlJc w:val="left"/>
+      <w:pPr>
+        <w:tabs>
+          <w:tab w:val="num" w:pos="2160"/>
+        </w:tabs>
+        <w:ind w:left="2160" w:hanging="360"/>
+      </w:pPr>
+      <w:rPr>
+        <w:rFonts w:ascii="Wingdings" w:hAnsi="Wingdings" w:hint="default"/>
+        <w:sz w:val="20"/>
+      </w:rPr>
+    </w:lvl>
+    <w:lvl w:ilvl="3" w:tentative="1">
+      <w:start w:val="1"/>
+      <w:numFmt w:val="bullet"/>
+      <w:lvlText w:val=""/>
+      <w:lvlJc w:val="left"/>
+      <w:pPr>
+        <w:tabs>
+          <w:tab w:val="num" w:pos="2880"/>
+        </w:tabs>
+        <w:ind w:left="2880" w:hanging="360"/>
+      </w:pPr>
+      <w:rPr>
+        <w:rFonts w:ascii="Wingdings" w:hAnsi="Wingdings" w:hint="default"/>
+        <w:sz w:val="20"/>
+      </w:rPr>
+    </w:lvl>
+    <w:lvl w:ilvl="4" w:tentative="1">
+      <w:start w:val="1"/>
+      <w:numFmt w:val="bullet"/>
+      <w:lvlText w:val=""/>
+      <w:lvlJc w:val="left"/>
+      <w:pPr>
+        <w:tabs>
+          <w:tab w:val="num" w:pos="3600"/>
+        </w:tabs>
+        <w:ind w:left="3600" w:hanging="360"/>
+      </w:pPr>
+      <w:rPr>
+        <w:rFonts w:ascii="Wingdings" w:hAnsi="Wingdings" w:hint="default"/>
+        <w:sz w:val="20"/>
+      </w:rPr>
+    </w:lvl>
+    <w:lvl w:ilvl="5" w:tentative="1">
+      <w:start w:val="1"/>
+      <w:numFmt w:val="bullet"/>
+      <w:lvlText w:val=""/>
+      <w:lvlJc w:val="left"/>
+      <w:pPr>
+        <w:tabs>
+          <w:tab w:val="num" w:pos="4320"/>
+        </w:tabs>
+        <w:ind w:left="4320" w:hanging="360"/>
+      </w:pPr>
+      <w:rPr>
+        <w:rFonts w:ascii="Wingdings" w:hAnsi="Wingdings" w:hint="default"/>
+        <w:sz w:val="20"/>
+      </w:rPr>
+    </w:lvl>
+    <w:lvl w:ilvl="6" w:tentative="1">
+      <w:start w:val="1"/>
+      <w:numFmt w:val="bullet"/>
+      <w:lvlText w:val=""/>
+      <w:lvlJc w:val="left"/>
+      <w:pPr>
+        <w:tabs>
+          <w:tab w:val="num" w:pos="5040"/>
+        </w:tabs>
+        <w:ind w:left="5040" w:hanging="360"/>
+      </w:pPr>
+      <w:rPr>
+        <w:rFonts w:ascii="Wingdings" w:hAnsi="Wingdings" w:hint="default"/>
+        <w:sz w:val="20"/>
+      </w:rPr>
+    </w:lvl>
+    <w:lvl w:ilvl="7" w:tentative="1">
+      <w:start w:val="1"/>
+      <w:numFmt w:val="bullet"/>
+      <w:lvlText w:val=""/>
+      <w:lvlJc w:val="left"/>
+      <w:pPr>
+        <w:tabs>
+          <w:tab w:val="num" w:pos="5760"/>
+        </w:tabs>
+        <w:ind w:left="5760" w:hanging="360"/>
+      </w:pPr>
+      <w:rPr>
+        <w:rFonts w:ascii="Wingdings" w:hAnsi="Wingdings" w:hint="default"/>
+        <w:sz w:val="20"/>
+      </w:rPr>
+    </w:lvl>
+    <w:lvl w:ilvl="8" w:tentative="1">
+      <w:start w:val="1"/>
+      <w:numFmt w:val="bullet"/>
+      <w:lvlText w:val=""/>
+      <w:lvlJc w:val="left"/>
+      <w:pPr>
+        <w:tabs>
+          <w:tab w:val="num" w:pos="6480"/>
+        </w:tabs>
+        <w:ind w:left="6480" w:hanging="360"/>
+      </w:pPr>
+      <w:rPr>
+        <w:rFonts w:ascii="Wingdings" w:hAnsi="Wingdings" w:hint="default"/>
+        <w:sz w:val="20"/>
+      </w:rPr>
+    </w:lvl>
+  </w:abstractNum>
+  <w:abstractNum w:abstractNumId="7" w15:restartNumberingAfterBreak="0">
     <w:nsid w:val="195A4D89"/>
     <w:multiLevelType w:val="multilevel"/>
     <w:tmpl w:val="8E281562"/>
@@ -2570,7 +3193,7 @@
       </w:rPr>
     </w:lvl>
   </w:abstractNum>
-  <w:abstractNum w:abstractNumId="6" w15:restartNumberingAfterBreak="0">
+  <w:abstractNum w:abstractNumId="8" w15:restartNumberingAfterBreak="0">
     <w:nsid w:val="1B400C35"/>
     <w:multiLevelType w:val="multilevel"/>
     <w:tmpl w:val="F3D26F80"/>
@@ -2719,7 +3342,7 @@
       </w:rPr>
     </w:lvl>
   </w:abstractNum>
-  <w:abstractNum w:abstractNumId="7" w15:restartNumberingAfterBreak="0">
+  <w:abstractNum w:abstractNumId="9" w15:restartNumberingAfterBreak="0">
     <w:nsid w:val="20396898"/>
     <w:multiLevelType w:val="multilevel"/>
     <w:tmpl w:val="B2329DEA"/>
@@ -2868,7 +3491,7 @@
       </w:rPr>
     </w:lvl>
   </w:abstractNum>
-  <w:abstractNum w:abstractNumId="8" w15:restartNumberingAfterBreak="0">
+  <w:abstractNum w:abstractNumId="10" w15:restartNumberingAfterBreak="0">
     <w:nsid w:val="25C4165F"/>
     <w:multiLevelType w:val="multilevel"/>
     <w:tmpl w:val="03E0E49C"/>
@@ -3017,7 +3640,7 @@
       </w:rPr>
     </w:lvl>
   </w:abstractNum>
-  <w:abstractNum w:abstractNumId="9" w15:restartNumberingAfterBreak="0">
+  <w:abstractNum w:abstractNumId="11" w15:restartNumberingAfterBreak="0">
     <w:nsid w:val="33AE5D01"/>
     <w:multiLevelType w:val="multilevel"/>
     <w:tmpl w:val="6BB43EFE"/>
@@ -3166,7 +3789,156 @@
       </w:rPr>
     </w:lvl>
   </w:abstractNum>
-  <w:abstractNum w:abstractNumId="10" w15:restartNumberingAfterBreak="0">
+  <w:abstractNum w:abstractNumId="12" w15:restartNumberingAfterBreak="0">
+    <w:nsid w:val="39290DF0"/>
+    <w:multiLevelType w:val="multilevel"/>
+    <w:tmpl w:val="CB421CC6"/>
+    <w:lvl w:ilvl="0">
+      <w:start w:val="1"/>
+      <w:numFmt w:val="bullet"/>
+      <w:lvlText w:val=""/>
+      <w:lvlJc w:val="left"/>
+      <w:pPr>
+        <w:tabs>
+          <w:tab w:val="num" w:pos="720"/>
+        </w:tabs>
+        <w:ind w:left="720" w:hanging="360"/>
+      </w:pPr>
+      <w:rPr>
+        <w:rFonts w:ascii="Symbol" w:hAnsi="Symbol" w:hint="default"/>
+        <w:sz w:val="20"/>
+      </w:rPr>
+    </w:lvl>
+    <w:lvl w:ilvl="1" w:tentative="1">
+      <w:start w:val="1"/>
+      <w:numFmt w:val="bullet"/>
+      <w:lvlText w:val="o"/>
+      <w:lvlJc w:val="left"/>
+      <w:pPr>
+        <w:tabs>
+          <w:tab w:val="num" w:pos="1440"/>
+        </w:tabs>
+        <w:ind w:left="1440" w:hanging="360"/>
+      </w:pPr>
+      <w:rPr>
+        <w:rFonts w:ascii="Courier New" w:hAnsi="Courier New" w:hint="default"/>
+        <w:sz w:val="20"/>
+      </w:rPr>
+    </w:lvl>
+    <w:lvl w:ilvl="2" w:tentative="1">
+      <w:start w:val="1"/>
+      <w:numFmt w:val="bullet"/>
+      <w:lvlText w:val=""/>
+      <w:lvlJc w:val="left"/>
+      <w:pPr>
+        <w:tabs>
+          <w:tab w:val="num" w:pos="2160"/>
+        </w:tabs>
+        <w:ind w:left="2160" w:hanging="360"/>
+      </w:pPr>
+      <w:rPr>
+        <w:rFonts w:ascii="Wingdings" w:hAnsi="Wingdings" w:hint="default"/>
+        <w:sz w:val="20"/>
+      </w:rPr>
+    </w:lvl>
+    <w:lvl w:ilvl="3" w:tentative="1">
+      <w:start w:val="1"/>
+      <w:numFmt w:val="bullet"/>
+      <w:lvlText w:val=""/>
+      <w:lvlJc w:val="left"/>
+      <w:pPr>
+        <w:tabs>
+          <w:tab w:val="num" w:pos="2880"/>
+        </w:tabs>
+        <w:ind w:left="2880" w:hanging="360"/>
+      </w:pPr>
+      <w:rPr>
+        <w:rFonts w:ascii="Wingdings" w:hAnsi="Wingdings" w:hint="default"/>
+        <w:sz w:val="20"/>
+      </w:rPr>
+    </w:lvl>
+    <w:lvl w:ilvl="4" w:tentative="1">
+      <w:start w:val="1"/>
+      <w:numFmt w:val="bullet"/>
+      <w:lvlText w:val=""/>
+      <w:lvlJc w:val="left"/>
+      <w:pPr>
+        <w:tabs>
+          <w:tab w:val="num" w:pos="3600"/>
+        </w:tabs>
+        <w:ind w:left="3600" w:hanging="360"/>
+      </w:pPr>
+      <w:rPr>
+        <w:rFonts w:ascii="Wingdings" w:hAnsi="Wingdings" w:hint="default"/>
+        <w:sz w:val="20"/>
+      </w:rPr>
+    </w:lvl>
+    <w:lvl w:ilvl="5" w:tentative="1">
+      <w:start w:val="1"/>
+      <w:numFmt w:val="bullet"/>
+      <w:lvlText w:val=""/>
+      <w:lvlJc w:val="left"/>
+      <w:pPr>
+        <w:tabs>
+          <w:tab w:val="num" w:pos="4320"/>
+        </w:tabs>
+        <w:ind w:left="4320" w:hanging="360"/>
+      </w:pPr>
+      <w:rPr>
+        <w:rFonts w:ascii="Wingdings" w:hAnsi="Wingdings" w:hint="default"/>
+        <w:sz w:val="20"/>
+      </w:rPr>
+    </w:lvl>
+    <w:lvl w:ilvl="6" w:tentative="1">
+      <w:start w:val="1"/>
+      <w:numFmt w:val="bullet"/>
+      <w:lvlText w:val=""/>
+      <w:lvlJc w:val="left"/>
+      <w:pPr>
+        <w:tabs>
+          <w:tab w:val="num" w:pos="5040"/>
+        </w:tabs>
+        <w:ind w:left="5040" w:hanging="360"/>
+      </w:pPr>
+      <w:rPr>
+        <w:rFonts w:ascii="Wingdings" w:hAnsi="Wingdings" w:hint="default"/>
+        <w:sz w:val="20"/>
+      </w:rPr>
+    </w:lvl>
+    <w:lvl w:ilvl="7" w:tentative="1">
+      <w:start w:val="1"/>
+      <w:numFmt w:val="bullet"/>
+      <w:lvlText w:val=""/>
+      <w:lvlJc w:val="left"/>
+      <w:pPr>
+        <w:tabs>
+          <w:tab w:val="num" w:pos="5760"/>
+        </w:tabs>
+        <w:ind w:left="5760" w:hanging="360"/>
+      </w:pPr>
+      <w:rPr>
+        <w:rFonts w:ascii="Wingdings" w:hAnsi="Wingdings" w:hint="default"/>
+        <w:sz w:val="20"/>
+      </w:rPr>
+    </w:lvl>
+    <w:lvl w:ilvl="8" w:tentative="1">
+      <w:start w:val="1"/>
+      <w:numFmt w:val="bullet"/>
+      <w:lvlText w:val=""/>
+      <w:lvlJc w:val="left"/>
+      <w:pPr>
+        <w:tabs>
+          <w:tab w:val="num" w:pos="6480"/>
+        </w:tabs>
+        <w:ind w:left="6480" w:hanging="360"/>
+      </w:pPr>
+      <w:rPr>
+        <w:rFonts w:ascii="Wingdings" w:hAnsi="Wingdings" w:hint="default"/>
+        <w:sz w:val="20"/>
+      </w:rPr>
+    </w:lvl>
+  </w:abstractNum>
+  <w:abstractNum w:abstractNumId="13" w15:restartNumberingAfterBreak="0">
     <w:nsid w:val="399F3EF3"/>
     <w:multiLevelType w:val="multilevel"/>
     <w:tmpl w:val="6BFC3500"/>
@@ -3315,7 +4087,7 @@
       </w:rPr>
     </w:lvl>
   </w:abstractNum>
-  <w:abstractNum w:abstractNumId="11" w15:restartNumberingAfterBreak="0">
+  <w:abstractNum w:abstractNumId="14" w15:restartNumberingAfterBreak="0">
     <w:nsid w:val="43C356D9"/>
     <w:multiLevelType w:val="multilevel"/>
     <w:tmpl w:val="027A6A0A"/>
@@ -3464,7 +4236,7 @@
       </w:rPr>
     </w:lvl>
   </w:abstractNum>
-  <w:abstractNum w:abstractNumId="12" w15:restartNumberingAfterBreak="0">
+  <w:abstractNum w:abstractNumId="15" w15:restartNumberingAfterBreak="0">
     <w:nsid w:val="4A41669D"/>
     <w:multiLevelType w:val="multilevel"/>
     <w:tmpl w:val="D82CCB92"/>
@@ -3613,7 +4385,7 @@
       </w:rPr>
     </w:lvl>
   </w:abstractNum>
-  <w:abstractNum w:abstractNumId="13" w15:restartNumberingAfterBreak="0">
+  <w:abstractNum w:abstractNumId="16" w15:restartNumberingAfterBreak="0">
     <w:nsid w:val="51A62479"/>
     <w:multiLevelType w:val="multilevel"/>
     <w:tmpl w:val="D304C874"/>
@@ -3762,7 +4534,7 @@
       </w:rPr>
     </w:lvl>
   </w:abstractNum>
-  <w:abstractNum w:abstractNumId="14" w15:restartNumberingAfterBreak="0">
+  <w:abstractNum w:abstractNumId="17" w15:restartNumberingAfterBreak="0">
     <w:nsid w:val="5B69054E"/>
     <w:multiLevelType w:val="multilevel"/>
     <w:tmpl w:val="4EBE384A"/>
@@ -3911,7 +4683,7 @@
       </w:rPr>
     </w:lvl>
   </w:abstractNum>
-  <w:abstractNum w:abstractNumId="15" w15:restartNumberingAfterBreak="0">
+  <w:abstractNum w:abstractNumId="18" w15:restartNumberingAfterBreak="0">
     <w:nsid w:val="61DD36E6"/>
     <w:multiLevelType w:val="multilevel"/>
     <w:tmpl w:val="8682A43C"/>
@@ -4060,7 +4832,7 @@
       </w:rPr>
     </w:lvl>
   </w:abstractNum>
-  <w:abstractNum w:abstractNumId="16" w15:restartNumberingAfterBreak="0">
+  <w:abstractNum w:abstractNumId="19" w15:restartNumberingAfterBreak="0">
     <w:nsid w:val="65E26350"/>
     <w:multiLevelType w:val="multilevel"/>
     <w:tmpl w:val="5FE69228"/>
@@ -4209,7 +4981,156 @@
       </w:rPr>
     </w:lvl>
   </w:abstractNum>
-  <w:abstractNum w:abstractNumId="17" w15:restartNumberingAfterBreak="0">
+  <w:abstractNum w:abstractNumId="20" w15:restartNumberingAfterBreak="0">
+    <w:nsid w:val="70734130"/>
+    <w:multiLevelType w:val="multilevel"/>
+    <w:tmpl w:val="FF8E7FD4"/>
+    <w:lvl w:ilvl="0">
+      <w:start w:val="1"/>
+      <w:numFmt w:val="bullet"/>
+      <w:lvlText w:val=""/>
+      <w:lvlJc w:val="left"/>
+      <w:pPr>
+        <w:tabs>
+          <w:tab w:val="num" w:pos="720"/>
+        </w:tabs>
+        <w:ind w:left="720" w:hanging="360"/>
+      </w:pPr>
+      <w:rPr>
+        <w:rFonts w:ascii="Symbol" w:hAnsi="Symbol" w:hint="default"/>
+        <w:sz w:val="20"/>
+      </w:rPr>
+    </w:lvl>
+    <w:lvl w:ilvl="1" w:tentative="1">
+      <w:start w:val="1"/>
+      <w:numFmt w:val="bullet"/>
+      <w:lvlText w:val="o"/>
+      <w:lvlJc w:val="left"/>
+      <w:pPr>
+        <w:tabs>
+          <w:tab w:val="num" w:pos="1440"/>
+        </w:tabs>
+        <w:ind w:left="1440" w:hanging="360"/>
+      </w:pPr>
+      <w:rPr>
+        <w:rFonts w:ascii="Courier New" w:hAnsi="Courier New" w:hint="default"/>
+        <w:sz w:val="20"/>
+      </w:rPr>
+    </w:lvl>
+    <w:lvl w:ilvl="2" w:tentative="1">
+      <w:start w:val="1"/>
+      <w:numFmt w:val="bullet"/>
+      <w:lvlText w:val=""/>
+      <w:lvlJc w:val="left"/>
+      <w:pPr>
+        <w:tabs>
+          <w:tab w:val="num" w:pos="2160"/>
+        </w:tabs>
+        <w:ind w:left="2160" w:hanging="360"/>
+      </w:pPr>
+      <w:rPr>
+        <w:rFonts w:ascii="Wingdings" w:hAnsi="Wingdings" w:hint="default"/>
+        <w:sz w:val="20"/>
+      </w:rPr>
+    </w:lvl>
+    <w:lvl w:ilvl="3" w:tentative="1">
+      <w:start w:val="1"/>
+      <w:numFmt w:val="bullet"/>
+      <w:lvlText w:val=""/>
+      <w:lvlJc w:val="left"/>
+      <w:pPr>
+        <w:tabs>
+          <w:tab w:val="num" w:pos="2880"/>
+        </w:tabs>
+        <w:ind w:left="2880" w:hanging="360"/>
+      </w:pPr>
+      <w:rPr>
+        <w:rFonts w:ascii="Wingdings" w:hAnsi="Wingdings" w:hint="default"/>
+        <w:sz w:val="20"/>
+      </w:rPr>
+    </w:lvl>
+    <w:lvl w:ilvl="4" w:tentative="1">
+      <w:start w:val="1"/>
+      <w:numFmt w:val="bullet"/>
+      <w:lvlText w:val=""/>
+      <w:lvlJc w:val="left"/>
+      <w:pPr>
+        <w:tabs>
+          <w:tab w:val="num" w:pos="3600"/>
+        </w:tabs>
+        <w:ind w:left="3600" w:hanging="360"/>
+      </w:pPr>
+      <w:rPr>
+        <w:rFonts w:ascii="Wingdings" w:hAnsi="Wingdings" w:hint="default"/>
+        <w:sz w:val="20"/>
+      </w:rPr>
+    </w:lvl>
+    <w:lvl w:ilvl="5" w:tentative="1">
+      <w:start w:val="1"/>
+      <w:numFmt w:val="bullet"/>
+      <w:lvlText w:val=""/>
+      <w:lvlJc w:val="left"/>
+      <w:pPr>
+        <w:tabs>
+          <w:tab w:val="num" w:pos="4320"/>
+        </w:tabs>
+        <w:ind w:left="4320" w:hanging="360"/>
+      </w:pPr>
+      <w:rPr>
+        <w:rFonts w:ascii="Wingdings" w:hAnsi="Wingdings" w:hint="default"/>
+        <w:sz w:val="20"/>
+      </w:rPr>
+    </w:lvl>
+    <w:lvl w:ilvl="6" w:tentative="1">
+      <w:start w:val="1"/>
+      <w:numFmt w:val="bullet"/>
+      <w:lvlText w:val=""/>
+      <w:lvlJc w:val="left"/>
+      <w:pPr>
+        <w:tabs>
+          <w:tab w:val="num" w:pos="5040"/>
+        </w:tabs>
+        <w:ind w:left="5040" w:hanging="360"/>
+      </w:pPr>
+      <w:rPr>
+        <w:rFonts w:ascii="Wingdings" w:hAnsi="Wingdings" w:hint="default"/>
+        <w:sz w:val="20"/>
+      </w:rPr>
+    </w:lvl>
+    <w:lvl w:ilvl="7" w:tentative="1">
+      <w:start w:val="1"/>
+      <w:numFmt w:val="bullet"/>
+      <w:lvlText w:val=""/>
+      <w:lvlJc w:val="left"/>
+      <w:pPr>
+        <w:tabs>
+          <w:tab w:val="num" w:pos="5760"/>
+        </w:tabs>
+        <w:ind w:left="5760" w:hanging="360"/>
+      </w:pPr>
+      <w:rPr>
+        <w:rFonts w:ascii="Wingdings" w:hAnsi="Wingdings" w:hint="default"/>
+        <w:sz w:val="20"/>
+      </w:rPr>
+    </w:lvl>
+    <w:lvl w:ilvl="8" w:tentative="1">
+      <w:start w:val="1"/>
+      <w:numFmt w:val="bullet"/>
+      <w:lvlText w:val=""/>
+      <w:lvlJc w:val="left"/>
+      <w:pPr>
+        <w:tabs>
+          <w:tab w:val="num" w:pos="6480"/>
+        </w:tabs>
+        <w:ind w:left="6480" w:hanging="360"/>
+      </w:pPr>
+      <w:rPr>
+        <w:rFonts w:ascii="Wingdings" w:hAnsi="Wingdings" w:hint="default"/>
+        <w:sz w:val="20"/>
+      </w:rPr>
+    </w:lvl>
+  </w:abstractNum>
+  <w:abstractNum w:abstractNumId="21" w15:restartNumberingAfterBreak="0">
     <w:nsid w:val="73C653C7"/>
     <w:multiLevelType w:val="multilevel"/>
     <w:tmpl w:val="6246A288"/>
@@ -4358,7 +5279,7 @@
       </w:rPr>
     </w:lvl>
   </w:abstractNum>
-  <w:abstractNum w:abstractNumId="18" w15:restartNumberingAfterBreak="0">
+  <w:abstractNum w:abstractNumId="22" w15:restartNumberingAfterBreak="0">
     <w:nsid w:val="75FA44DE"/>
     <w:multiLevelType w:val="multilevel"/>
     <w:tmpl w:val="64A6BE7A"/>
@@ -4507,7 +5428,7 @@
       </w:rPr>
     </w:lvl>
   </w:abstractNum>
-  <w:abstractNum w:abstractNumId="19" w15:restartNumberingAfterBreak="0">
+  <w:abstractNum w:abstractNumId="23" w15:restartNumberingAfterBreak="0">
     <w:nsid w:val="76932471"/>
     <w:multiLevelType w:val="multilevel"/>
     <w:tmpl w:val="761683DA"/>
@@ -4656,7 +5577,7 @@
       </w:rPr>
     </w:lvl>
   </w:abstractNum>
-  <w:abstractNum w:abstractNumId="20" w15:restartNumberingAfterBreak="0">
+  <w:abstractNum w:abstractNumId="24" w15:restartNumberingAfterBreak="0">
     <w:nsid w:val="76B24B17"/>
     <w:multiLevelType w:val="multilevel"/>
     <w:tmpl w:val="DD161820"/>
@@ -4805,7 +5726,7 @@
       </w:rPr>
     </w:lvl>
   </w:abstractNum>
-  <w:abstractNum w:abstractNumId="21" w15:restartNumberingAfterBreak="0">
+  <w:abstractNum w:abstractNumId="25" w15:restartNumberingAfterBreak="0">
     <w:nsid w:val="7763579A"/>
     <w:multiLevelType w:val="multilevel"/>
     <w:tmpl w:val="1460FF0A"/>
@@ -4954,7 +5875,7 @@
       </w:rPr>
     </w:lvl>
   </w:abstractNum>
-  <w:abstractNum w:abstractNumId="22" w15:restartNumberingAfterBreak="0">
+  <w:abstractNum w:abstractNumId="26" w15:restartNumberingAfterBreak="0">
     <w:nsid w:val="787C7A5D"/>
     <w:multiLevelType w:val="multilevel"/>
     <w:tmpl w:val="362ED21C"/>
@@ -5103,7 +6024,7 @@
       </w:rPr>
     </w:lvl>
   </w:abstractNum>
-  <w:abstractNum w:abstractNumId="23" w15:restartNumberingAfterBreak="0">
+  <w:abstractNum w:abstractNumId="27" w15:restartNumberingAfterBreak="0">
     <w:nsid w:val="7F25014E"/>
     <w:multiLevelType w:val="multilevel"/>
     <w:tmpl w:val="87788868"/>
@@ -5253,76 +6174,88 @@
     </w:lvl>
   </w:abstractNum>
   <w:num w:numId="1" w16cid:durableId="152068965">
-    <w:abstractNumId w:val="6"/>
+    <w:abstractNumId w:val="8"/>
   </w:num>
   <w:num w:numId="2" w16cid:durableId="2102290164">
+    <w:abstractNumId w:val="18"/>
+  </w:num>
+  <w:num w:numId="3" w16cid:durableId="1460339884">
+    <w:abstractNumId w:val="19"/>
+  </w:num>
+  <w:num w:numId="4" w16cid:durableId="1739018508">
+    <w:abstractNumId w:val="7"/>
+  </w:num>
+  <w:num w:numId="5" w16cid:durableId="896282314">
+    <w:abstractNumId w:val="27"/>
+  </w:num>
+  <w:num w:numId="6" w16cid:durableId="1360743008">
+    <w:abstractNumId w:val="14"/>
+  </w:num>
+  <w:num w:numId="7" w16cid:durableId="527989075">
+    <w:abstractNumId w:val="3"/>
+  </w:num>
+  <w:num w:numId="8" w16cid:durableId="1539314489">
+    <w:abstractNumId w:val="13"/>
+  </w:num>
+  <w:num w:numId="9" w16cid:durableId="1926063725">
+    <w:abstractNumId w:val="11"/>
+  </w:num>
+  <w:num w:numId="10" w16cid:durableId="2049525299">
+    <w:abstractNumId w:val="10"/>
+  </w:num>
+  <w:num w:numId="11" w16cid:durableId="1846163322">
+    <w:abstractNumId w:val="21"/>
+  </w:num>
+  <w:num w:numId="12" w16cid:durableId="331952524">
+    <w:abstractNumId w:val="4"/>
+  </w:num>
+  <w:num w:numId="13" w16cid:durableId="1658921630">
+    <w:abstractNumId w:val="24"/>
+  </w:num>
+  <w:num w:numId="14" w16cid:durableId="1430009259">
+    <w:abstractNumId w:val="25"/>
+  </w:num>
+  <w:num w:numId="15" w16cid:durableId="713771419">
+    <w:abstractNumId w:val="2"/>
+  </w:num>
+  <w:num w:numId="16" w16cid:durableId="1755011840">
+    <w:abstractNumId w:val="23"/>
+  </w:num>
+  <w:num w:numId="17" w16cid:durableId="1681931220">
+    <w:abstractNumId w:val="17"/>
+  </w:num>
+  <w:num w:numId="18" w16cid:durableId="221062535">
+    <w:abstractNumId w:val="26"/>
+  </w:num>
+  <w:num w:numId="19" w16cid:durableId="1524127589">
+    <w:abstractNumId w:val="9"/>
+  </w:num>
+  <w:num w:numId="20" w16cid:durableId="1369603494">
+    <w:abstractNumId w:val="1"/>
+  </w:num>
+  <w:num w:numId="21" w16cid:durableId="1579055599">
+    <w:abstractNumId w:val="5"/>
+  </w:num>
+  <w:num w:numId="22" w16cid:durableId="258293515">
     <w:abstractNumId w:val="15"/>
   </w:num>
-  <w:num w:numId="3" w16cid:durableId="1460339884">
+  <w:num w:numId="23" w16cid:durableId="1232472367">
     <w:abstractNumId w:val="16"/>
   </w:num>
-  <w:num w:numId="4" w16cid:durableId="1739018508">
-    <w:abstractNumId w:val="5"/>
+  <w:num w:numId="24" w16cid:durableId="1701780755">
+    <w:abstractNumId w:val="22"/>
   </w:num>
-  <w:num w:numId="5" w16cid:durableId="896282314">
-    <w:abstractNumId w:val="23"/>
+  <w:num w:numId="25" w16cid:durableId="11953364">
+    <w:abstractNumId w:val="0"/>
   </w:num>
-  <w:num w:numId="6" w16cid:durableId="1360743008">
-    <w:abstractNumId w:val="11"/>
-  </w:num>
-  <w:num w:numId="7" w16cid:durableId="527989075">
-    <w:abstractNumId w:val="2"/>
-  </w:num>
-  <w:num w:numId="8" w16cid:durableId="1539314489">
-    <w:abstractNumId w:val="10"/>
-  </w:num>
-  <w:num w:numId="9" w16cid:durableId="1926063725">
-    <w:abstractNumId w:val="9"/>
-  </w:num>
-  <w:num w:numId="10" w16cid:durableId="2049525299">
-    <w:abstractNumId w:val="8"/>
-  </w:num>
-  <w:num w:numId="11" w16cid:durableId="1846163322">
-    <w:abstractNumId w:val="17"/>
-  </w:num>
-  <w:num w:numId="12" w16cid:durableId="331952524">
-    <w:abstractNumId w:val="3"/>
-  </w:num>
-  <w:num w:numId="13" w16cid:durableId="1658921630">
+  <w:num w:numId="26" w16cid:durableId="1181432633">
     <w:abstractNumId w:val="20"/>
   </w:num>
-  <w:num w:numId="14" w16cid:durableId="1430009259">
-    <w:abstractNumId w:val="21"/>
-  </w:num>
-  <w:num w:numId="15" w16cid:durableId="713771419">
-    <w:abstractNumId w:val="1"/>
-  </w:num>
-  <w:num w:numId="16" w16cid:durableId="1755011840">
-    <w:abstractNumId w:val="19"/>
-  </w:num>
-  <w:num w:numId="17" w16cid:durableId="1681931220">
-    <w:abstractNumId w:val="14"/>
-  </w:num>
-  <w:num w:numId="18" w16cid:durableId="221062535">
-    <w:abstractNumId w:val="22"/>
-  </w:num>
-  <w:num w:numId="19" w16cid:durableId="1524127589">
-    <w:abstractNumId w:val="7"/>
-  </w:num>
-  <w:num w:numId="20" w16cid:durableId="1369603494">
-    <w:abstractNumId w:val="0"/>
-  </w:num>
-  <w:num w:numId="21" w16cid:durableId="1579055599">
-    <w:abstractNumId w:val="4"/>
-  </w:num>
-  <w:num w:numId="22" w16cid:durableId="258293515">
+  <w:num w:numId="27" w16cid:durableId="610433085">
     <w:abstractNumId w:val="12"/>
   </w:num>
-  <w:num w:numId="23" w16cid:durableId="1232472367">
-    <w:abstractNumId w:val="13"/>
-  </w:num>
-  <w:num w:numId="24" w16cid:durableId="1701780755">
-    <w:abstractNumId w:val="18"/>
+  <w:num w:numId="28" w16cid:durableId="596912515">
+    <w:abstractNumId w:val="6"/>
   </w:num>
 </w:numbering>
 </file>

</xml_diff>